<commit_message>
Add LocalAI project info
</commit_message>
<xml_diff>
--- a/Documents/cv-2026-en-ext.docx
+++ b/Documents/cv-2026-en-ext.docx
@@ -438,7 +438,7 @@
                 <w:sz w:val="22"/>
                 <w:szCs w:val="22"/>
               </w:rPr>
-              <w:t>Since May 2026, after current contract completion.</w:t>
+              <w:t>May 2026, after current contract completion.</w:t>
             </w:r>
           </w:p>
         </w:tc>
@@ -1705,23 +1705,30 @@
           <w:sz w:val="22"/>
           <w:szCs w:val="22"/>
         </w:rPr>
-        <w:t xml:space="preserve"> Deutz</w:t>
+        <w:t xml:space="preserve"> Deut</w:t>
       </w:r>
       <w:r>
         <w:rPr>
           <w:sz w:val="22"/>
           <w:szCs w:val="22"/>
         </w:rPr>
-        <w:t>.</w:t>
-      </w:r>
-      <w:bookmarkEnd w:id="3"/>
-    </w:p>
-    <w:p>
-      <w:pPr>
+        <w:t>sch</w:t>
+      </w:r>
+      <w:r>
         <w:rPr>
           <w:sz w:val="22"/>
           <w:szCs w:val="22"/>
         </w:rPr>
+        <w:t>.</w:t>
+      </w:r>
+      <w:bookmarkEnd w:id="3"/>
+    </w:p>
+    <w:p>
+      <w:pPr>
+        <w:rPr>
+          <w:sz w:val="22"/>
+          <w:szCs w:val="22"/>
+        </w:rPr>
       </w:pPr>
     </w:p>
     <w:p>
@@ -1735,26 +1742,45 @@
     <w:p>
       <w:pPr>
         <w:pStyle w:val="Heading2"/>
-      </w:pPr>
-      <w:r>
+        <w:rPr>
+          <w:lang w:val="de-DE"/>
+        </w:rPr>
+      </w:pPr>
+      <w:r>
+        <w:rPr>
+          <w:lang w:val="de-DE"/>
+        </w:rPr>
         <w:t xml:space="preserve">05.2024 – </w:t>
       </w:r>
       <w:r>
+        <w:rPr>
+          <w:lang w:val="de-DE"/>
+        </w:rPr>
         <w:t>04</w:t>
       </w:r>
       <w:r>
+        <w:rPr>
+          <w:lang w:val="de-DE"/>
+        </w:rPr>
         <w:t>.202</w:t>
       </w:r>
       <w:r>
+        <w:rPr>
+          <w:lang w:val="de-DE"/>
+        </w:rPr>
         <w:t>6</w:t>
       </w:r>
       <w:r>
+        <w:rPr>
+          <w:lang w:val="de-DE"/>
+        </w:rPr>
         <w:t xml:space="preserve"> </w:t>
       </w:r>
       <w:r>
         <w:rPr>
           <w:b/>
           <w:bCs/>
+          <w:lang w:val="de-DE"/>
         </w:rPr>
         <w:t>Astronomisches Rechen-Institut (Heidelberg University)</w:t>
       </w:r>

</xml_diff>